<commit_message>
feat(29-02): extend poster with About the Organization section
- _build_poster_context returns org_context key
  ((wd.org_context or '').strip() or '[To be provided / À fournir]')
- build_poster_template.py adds 'About the Organization /
  À propos de l'organisation' section after Branch block
- 'org_context' added to required set in build script self-verify
- poster_template.docx regenerated from repo root
  (37,004 bytes — contains {{ org_context }} Jinja2 variable)

Turns the final Wave 0 RED stub GREEN:
  test_poster_org_context_section

Test count: 37 passed, 0 failed in test_export.py (32 pre-existing
+ 5 Wave 0 stubs); 184 passed, 0 failed in full backend suite.
</commit_message>
<xml_diff>
--- a/v2/backend/app/templates/poster_template.docx
+++ b/v2/backend/app/templates/poster_template.docx
@@ -53,6 +53,19 @@
     <w:p>
       <w:r>
         <w:t>{{ branch }}</w:t>
+      </w:r>
+    </w:p>
+    <w:p>
+      <w:r>
+        <w:rPr>
+          <w:b/>
+        </w:rPr>
+        <w:t>About the Organization / À propos de l'organisation:</w:t>
+      </w:r>
+    </w:p>
+    <w:p>
+      <w:r>
+        <w:t>{{ org_context }}</w:t>
       </w:r>
     </w:p>
     <w:p>

</xml_diff>